<commit_message>
Complete visual types map with real-text screenshots from board (all types)
Co-Authored-By: Claude Opus 4.8 <noreply@anthropic.com>
Claude-Session: https://claude.ai/code/session_014BTMoKe4qeivFFNX4KkDkH
</commit_message>
<xml_diff>
--- a/_audit/Типы_коммуникаций_визуальная_карта.docx
+++ b/_audit/Типы_коммуникаций_визуальная_карта.docx
@@ -25,7 +25,7 @@
           <w:color w:val="666666"/>
           <w:sz w:val="24"/>
         </w:rPr>
-        <w:t>Каждый тип с примерами-экранами</w:t>
+        <w:t>Каждый тип с примерами-экранами (реальные тексты с борда)</w:t>
       </w:r>
     </w:p>
     <w:p/>
@@ -38,7 +38,7 @@
           <w:color w:val="666666"/>
           <w:sz w:val="20"/>
         </w:rPr>
-        <w:t>Скриншоты Alert Dialog взяты из документации разработки (на них вместо текста — служебные ключи). Для остальных типов скриншоты — на Figma-борде; помечены «добрать из Figma». Имена Notification/Snackbar используются в значении, обратном стандарту — зафиксировать с разработкой.</w:t>
+        <w:t>Скриншоты нарезаны из борда System Communication Audit. Примечание: имена Notification и Snackbar используются в значении, обратном индустри-стандарту — зафиксировать с разработкой.</w:t>
       </w:r>
     </w:p>
     <w:p/>
@@ -88,10 +88,10 @@
         <w:rPr>
           <w:rFonts w:ascii="Arial" w:hAnsi="Arial"/>
           <w:b/>
-          <w:i w:val="0"/>
+          <w:color w:val="555555"/>
           <w:sz w:val="20"/>
         </w:rPr>
-        <w:t>Вариант ОБЫЧНЫЙ:</w:t>
+        <w:t>ОБЫЧНЫЙ</w:t>
       </w:r>
     </w:p>
     <w:tbl>
@@ -116,7 +116,7 @@
             <w:r>
               <w:drawing>
                 <wp:inline xmlns:a="http://schemas.openxmlformats.org/drawingml/2006/main" xmlns:pic="http://schemas.openxmlformats.org/drawingml/2006/picture">
-                  <wp:extent cx="1325880" cy="753341"/>
+                  <wp:extent cx="1417320" cy="2053199"/>
                   <wp:docPr id="1" name="Picture 1"/>
                   <wp:cNvGraphicFramePr>
                     <a:graphicFrameLocks noChangeAspect="1"/>
@@ -125,7 +125,7 @@
                     <a:graphicData uri="http://schemas.openxmlformats.org/drawingml/2006/picture">
                       <pic:pic>
                         <pic:nvPicPr>
-                          <pic:cNvPr id="0" name="M-01.png"/>
+                          <pic:cNvPr id="0" name="dlg_acesso_indisp.png"/>
                           <pic:cNvPicPr/>
                         </pic:nvPicPr>
                         <pic:blipFill>
@@ -137,7 +137,7 @@
                         <pic:spPr>
                           <a:xfrm>
                             <a:off x="0" y="0"/>
-                            <a:ext cx="1325880" cy="753341"/>
+                            <a:ext cx="1417320" cy="2053199"/>
                           </a:xfrm>
                           <a:prstGeom prst="rect"/>
                         </pic:spPr>
@@ -158,7 +158,7 @@
                 <w:color w:val="666666"/>
                 <w:sz w:val="16"/>
               </w:rPr>
-              <w:t>Проверка возраста</w:t>
+              <w:t>Доступ недоступен (SIGAP)</w:t>
             </w:r>
           </w:p>
         </w:tc>
@@ -171,7 +171,7 @@
             <w:r>
               <w:drawing>
                 <wp:inline xmlns:a="http://schemas.openxmlformats.org/drawingml/2006/main" xmlns:pic="http://schemas.openxmlformats.org/drawingml/2006/picture">
-                  <wp:extent cx="1325880" cy="1253229"/>
+                  <wp:extent cx="1417320" cy="610181"/>
                   <wp:docPr id="2" name="Picture 2"/>
                   <wp:cNvGraphicFramePr>
                     <a:graphicFrameLocks noChangeAspect="1"/>
@@ -180,7 +180,7 @@
                     <a:graphicData uri="http://schemas.openxmlformats.org/drawingml/2006/picture">
                       <pic:pic>
                         <pic:nvPicPr>
-                          <pic:cNvPr id="0" name="M-02.png"/>
+                          <pic:cNvPr id="0" name="dlg_no_demo.png"/>
                           <pic:cNvPicPr/>
                         </pic:nvPicPr>
                         <pic:blipFill>
@@ -192,339 +192,7 @@
                         <pic:spPr>
                           <a:xfrm>
                             <a:off x="0" y="0"/>
-                            <a:ext cx="1325880" cy="1253229"/>
-                          </a:xfrm>
-                          <a:prstGeom prst="rect"/>
-                        </pic:spPr>
-                      </pic:pic>
-                    </a:graphicData>
-                  </a:graphic>
-                </wp:inline>
-              </w:drawing>
-            </w:r>
-          </w:p>
-          <w:p>
-            <w:pPr>
-              <w:jc w:val="center"/>
-            </w:pPr>
-            <w:r>
-              <w:rPr>
-                <w:rFonts w:ascii="Arial" w:hAnsi="Arial"/>
-                <w:color w:val="666666"/>
-                <w:sz w:val="16"/>
-              </w:rPr>
-              <w:t>SIGAP-предупреждение</w:t>
-            </w:r>
-          </w:p>
-        </w:tc>
-        <w:tc>
-          <w:tcPr>
-            <w:tcW w:type="dxa" w:w="2160"/>
-          </w:tcPr>
-          <w:p>
-            <w:r/>
-            <w:r>
-              <w:drawing>
-                <wp:inline xmlns:a="http://schemas.openxmlformats.org/drawingml/2006/main" xmlns:pic="http://schemas.openxmlformats.org/drawingml/2006/picture">
-                  <wp:extent cx="1325880" cy="1109150"/>
-                  <wp:docPr id="3" name="Picture 3"/>
-                  <wp:cNvGraphicFramePr>
-                    <a:graphicFrameLocks noChangeAspect="1"/>
-                  </wp:cNvGraphicFramePr>
-                  <a:graphic>
-                    <a:graphicData uri="http://schemas.openxmlformats.org/drawingml/2006/picture">
-                      <pic:pic>
-                        <pic:nvPicPr>
-                          <pic:cNvPr id="0" name="M-04.png"/>
-                          <pic:cNvPicPr/>
-                        </pic:nvPicPr>
-                        <pic:blipFill>
-                          <a:blip r:embed="rId11"/>
-                          <a:stretch>
-                            <a:fillRect/>
-                          </a:stretch>
-                        </pic:blipFill>
-                        <pic:spPr>
-                          <a:xfrm>
-                            <a:off x="0" y="0"/>
-                            <a:ext cx="1325880" cy="1109150"/>
-                          </a:xfrm>
-                          <a:prstGeom prst="rect"/>
-                        </pic:spPr>
-                      </pic:pic>
-                    </a:graphicData>
-                  </a:graphic>
-                </wp:inline>
-              </w:drawing>
-            </w:r>
-          </w:p>
-          <w:p>
-            <w:pPr>
-              <w:jc w:val="center"/>
-            </w:pPr>
-            <w:r>
-              <w:rPr>
-                <w:rFonts w:ascii="Arial" w:hAnsi="Arial"/>
-                <w:color w:val="666666"/>
-                <w:sz w:val="16"/>
-              </w:rPr>
-              <w:t>KYC (Мексика)</w:t>
-            </w:r>
-          </w:p>
-        </w:tc>
-        <w:tc>
-          <w:tcPr>
-            <w:tcW w:type="dxa" w:w="2160"/>
-          </w:tcPr>
-          <w:p>
-            <w:r/>
-            <w:r>
-              <w:drawing>
-                <wp:inline xmlns:a="http://schemas.openxmlformats.org/drawingml/2006/main" xmlns:pic="http://schemas.openxmlformats.org/drawingml/2006/picture">
-                  <wp:extent cx="1325880" cy="697034"/>
-                  <wp:docPr id="4" name="Picture 4"/>
-                  <wp:cNvGraphicFramePr>
-                    <a:graphicFrameLocks noChangeAspect="1"/>
-                  </wp:cNvGraphicFramePr>
-                  <a:graphic>
-                    <a:graphicData uri="http://schemas.openxmlformats.org/drawingml/2006/picture">
-                      <pic:pic>
-                        <pic:nvPicPr>
-                          <pic:cNvPr id="0" name="M-05.png"/>
-                          <pic:cNvPicPr/>
-                        </pic:nvPicPr>
-                        <pic:blipFill>
-                          <a:blip r:embed="rId12"/>
-                          <a:stretch>
-                            <a:fillRect/>
-                          </a:stretch>
-                        </pic:blipFill>
-                        <pic:spPr>
-                          <a:xfrm>
-                            <a:off x="0" y="0"/>
-                            <a:ext cx="1325880" cy="697034"/>
-                          </a:xfrm>
-                          <a:prstGeom prst="rect"/>
-                        </pic:spPr>
-                      </pic:pic>
-                    </a:graphicData>
-                  </a:graphic>
-                </wp:inline>
-              </w:drawing>
-            </w:r>
-          </w:p>
-          <w:p>
-            <w:pPr>
-              <w:jc w:val="center"/>
-            </w:pPr>
-            <w:r>
-              <w:rPr>
-                <w:rFonts w:ascii="Arial" w:hAnsi="Arial"/>
-                <w:color w:val="666666"/>
-                <w:sz w:val="16"/>
-              </w:rPr>
-              <w:t>Re-KYC</w:t>
-            </w:r>
-          </w:p>
-        </w:tc>
-      </w:tr>
-      <w:tr>
-        <w:tc>
-          <w:tcPr>
-            <w:tcW w:type="dxa" w:w="2160"/>
-          </w:tcPr>
-          <w:p>
-            <w:r/>
-            <w:r>
-              <w:drawing>
-                <wp:inline xmlns:a="http://schemas.openxmlformats.org/drawingml/2006/main" xmlns:pic="http://schemas.openxmlformats.org/drawingml/2006/picture">
-                  <wp:extent cx="1325880" cy="707136"/>
-                  <wp:docPr id="5" name="Picture 5"/>
-                  <wp:cNvGraphicFramePr>
-                    <a:graphicFrameLocks noChangeAspect="1"/>
-                  </wp:cNvGraphicFramePr>
-                  <a:graphic>
-                    <a:graphicData uri="http://schemas.openxmlformats.org/drawingml/2006/picture">
-                      <pic:pic>
-                        <pic:nvPicPr>
-                          <pic:cNvPr id="0" name="M-07.png"/>
-                          <pic:cNvPicPr/>
-                        </pic:nvPicPr>
-                        <pic:blipFill>
-                          <a:blip r:embed="rId13"/>
-                          <a:stretch>
-                            <a:fillRect/>
-                          </a:stretch>
-                        </pic:blipFill>
-                        <pic:spPr>
-                          <a:xfrm>
-                            <a:off x="0" y="0"/>
-                            <a:ext cx="1325880" cy="707136"/>
-                          </a:xfrm>
-                          <a:prstGeom prst="rect"/>
-                        </pic:spPr>
-                      </pic:pic>
-                    </a:graphicData>
-                  </a:graphic>
-                </wp:inline>
-              </w:drawing>
-            </w:r>
-          </w:p>
-          <w:p>
-            <w:pPr>
-              <w:jc w:val="center"/>
-            </w:pPr>
-            <w:r>
-              <w:rPr>
-                <w:rFonts w:ascii="Arial" w:hAnsi="Arial"/>
-                <w:color w:val="666666"/>
-                <w:sz w:val="16"/>
-              </w:rPr>
-              <w:t>Верификация</w:t>
-            </w:r>
-          </w:p>
-        </w:tc>
-        <w:tc>
-          <w:tcPr>
-            <w:tcW w:type="dxa" w:w="2160"/>
-          </w:tcPr>
-          <w:p>
-            <w:r/>
-            <w:r>
-              <w:drawing>
-                <wp:inline xmlns:a="http://schemas.openxmlformats.org/drawingml/2006/main" xmlns:pic="http://schemas.openxmlformats.org/drawingml/2006/picture">
-                  <wp:extent cx="1325880" cy="999844"/>
-                  <wp:docPr id="6" name="Picture 6"/>
-                  <wp:cNvGraphicFramePr>
-                    <a:graphicFrameLocks noChangeAspect="1"/>
-                  </wp:cNvGraphicFramePr>
-                  <a:graphic>
-                    <a:graphicData uri="http://schemas.openxmlformats.org/drawingml/2006/picture">
-                      <pic:pic>
-                        <pic:nvPicPr>
-                          <pic:cNvPr id="0" name="M-09.png"/>
-                          <pic:cNvPicPr/>
-                        </pic:nvPicPr>
-                        <pic:blipFill>
-                          <a:blip r:embed="rId14"/>
-                          <a:stretch>
-                            <a:fillRect/>
-                          </a:stretch>
-                        </pic:blipFill>
-                        <pic:spPr>
-                          <a:xfrm>
-                            <a:off x="0" y="0"/>
-                            <a:ext cx="1325880" cy="999844"/>
-                          </a:xfrm>
-                          <a:prstGeom prst="rect"/>
-                        </pic:spPr>
-                      </pic:pic>
-                    </a:graphicData>
-                  </a:graphic>
-                </wp:inline>
-              </w:drawing>
-            </w:r>
-          </w:p>
-          <w:p>
-            <w:pPr>
-              <w:jc w:val="center"/>
-            </w:pPr>
-            <w:r>
-              <w:rPr>
-                <w:rFonts w:ascii="Arial" w:hAnsi="Arial"/>
-                <w:color w:val="666666"/>
-                <w:sz w:val="16"/>
-              </w:rPr>
-              <w:t>Первый бонус</w:t>
-            </w:r>
-          </w:p>
-        </w:tc>
-        <w:tc>
-          <w:tcPr>
-            <w:tcW w:type="dxa" w:w="2160"/>
-          </w:tcPr>
-          <w:p>
-            <w:r/>
-            <w:r>
-              <w:drawing>
-                <wp:inline xmlns:a="http://schemas.openxmlformats.org/drawingml/2006/main" xmlns:pic="http://schemas.openxmlformats.org/drawingml/2006/picture">
-                  <wp:extent cx="1325880" cy="1357829"/>
-                  <wp:docPr id="7" name="Picture 7"/>
-                  <wp:cNvGraphicFramePr>
-                    <a:graphicFrameLocks noChangeAspect="1"/>
-                  </wp:cNvGraphicFramePr>
-                  <a:graphic>
-                    <a:graphicData uri="http://schemas.openxmlformats.org/drawingml/2006/picture">
-                      <pic:pic>
-                        <pic:nvPicPr>
-                          <pic:cNvPr id="0" name="M-11.png"/>
-                          <pic:cNvPicPr/>
-                        </pic:nvPicPr>
-                        <pic:blipFill>
-                          <a:blip r:embed="rId15"/>
-                          <a:stretch>
-                            <a:fillRect/>
-                          </a:stretch>
-                        </pic:blipFill>
-                        <pic:spPr>
-                          <a:xfrm>
-                            <a:off x="0" y="0"/>
-                            <a:ext cx="1325880" cy="1357829"/>
-                          </a:xfrm>
-                          <a:prstGeom prst="rect"/>
-                        </pic:spPr>
-                      </pic:pic>
-                    </a:graphicData>
-                  </a:graphic>
-                </wp:inline>
-              </w:drawing>
-            </w:r>
-          </w:p>
-          <w:p>
-            <w:pPr>
-              <w:jc w:val="center"/>
-            </w:pPr>
-            <w:r>
-              <w:rPr>
-                <w:rFonts w:ascii="Arial" w:hAnsi="Arial"/>
-                <w:color w:val="666666"/>
-                <w:sz w:val="16"/>
-              </w:rPr>
-              <w:t>Купоны</w:t>
-            </w:r>
-          </w:p>
-        </w:tc>
-        <w:tc>
-          <w:tcPr>
-            <w:tcW w:type="dxa" w:w="2160"/>
-          </w:tcPr>
-          <w:p>
-            <w:r/>
-            <w:r>
-              <w:drawing>
-                <wp:inline xmlns:a="http://schemas.openxmlformats.org/drawingml/2006/main" xmlns:pic="http://schemas.openxmlformats.org/drawingml/2006/picture">
-                  <wp:extent cx="1325880" cy="575887"/>
-                  <wp:docPr id="8" name="Picture 8"/>
-                  <wp:cNvGraphicFramePr>
-                    <a:graphicFrameLocks noChangeAspect="1"/>
-                  </wp:cNvGraphicFramePr>
-                  <a:graphic>
-                    <a:graphicData uri="http://schemas.openxmlformats.org/drawingml/2006/picture">
-                      <pic:pic>
-                        <pic:nvPicPr>
-                          <pic:cNvPr id="0" name="E-08.png"/>
-                          <pic:cNvPicPr/>
-                        </pic:nvPicPr>
-                        <pic:blipFill>
-                          <a:blip r:embed="rId16"/>
-                          <a:stretch>
-                            <a:fillRect/>
-                          </a:stretch>
-                        </pic:blipFill>
-                        <pic:spPr>
-                          <a:xfrm>
-                            <a:off x="0" y="0"/>
-                            <a:ext cx="1325880" cy="575887"/>
+                            <a:ext cx="1417320" cy="610181"/>
                           </a:xfrm>
                           <a:prstGeom prst="rect"/>
                         </pic:spPr>
@@ -549,6 +217,462 @@
             </w:r>
           </w:p>
         </w:tc>
+        <w:tc>
+          <w:tcPr>
+            <w:tcW w:type="dxa" w:w="2160"/>
+          </w:tcPr>
+          <w:p>
+            <w:r/>
+            <w:r>
+              <w:drawing>
+                <wp:inline xmlns:a="http://schemas.openxmlformats.org/drawingml/2006/main" xmlns:pic="http://schemas.openxmlformats.org/drawingml/2006/picture">
+                  <wp:extent cx="1417320" cy="2183439"/>
+                  <wp:docPr id="3" name="Picture 3"/>
+                  <wp:cNvGraphicFramePr>
+                    <a:graphicFrameLocks noChangeAspect="1"/>
+                  </wp:cNvGraphicFramePr>
+                  <a:graphic>
+                    <a:graphicData uri="http://schemas.openxmlformats.org/drawingml/2006/picture">
+                      <pic:pic>
+                        <pic:nvPicPr>
+                          <pic:cNvPr id="0" name="dlg_address.png"/>
+                          <pic:cNvPicPr/>
+                        </pic:nvPicPr>
+                        <pic:blipFill>
+                          <a:blip r:embed="rId11"/>
+                          <a:stretch>
+                            <a:fillRect/>
+                          </a:stretch>
+                        </pic:blipFill>
+                        <pic:spPr>
+                          <a:xfrm>
+                            <a:off x="0" y="0"/>
+                            <a:ext cx="1417320" cy="2183439"/>
+                          </a:xfrm>
+                          <a:prstGeom prst="rect"/>
+                        </pic:spPr>
+                      </pic:pic>
+                    </a:graphicData>
+                  </a:graphic>
+                </wp:inline>
+              </w:drawing>
+            </w:r>
+          </w:p>
+          <w:p>
+            <w:pPr>
+              <w:jc w:val="center"/>
+            </w:pPr>
+            <w:r>
+              <w:rPr>
+                <w:rFonts w:ascii="Arial" w:hAnsi="Arial"/>
+                <w:color w:val="666666"/>
+                <w:sz w:val="16"/>
+              </w:rPr>
+              <w:t>Подтверждение адреса</w:t>
+            </w:r>
+          </w:p>
+        </w:tc>
+        <w:tc>
+          <w:tcPr>
+            <w:tcW w:type="dxa" w:w="2160"/>
+          </w:tcPr>
+          <w:p>
+            <w:r/>
+            <w:r>
+              <w:drawing>
+                <wp:inline xmlns:a="http://schemas.openxmlformats.org/drawingml/2006/main" xmlns:pic="http://schemas.openxmlformats.org/drawingml/2006/picture">
+                  <wp:extent cx="1417320" cy="1915297"/>
+                  <wp:docPr id="4" name="Picture 4"/>
+                  <wp:cNvGraphicFramePr>
+                    <a:graphicFrameLocks noChangeAspect="1"/>
+                  </wp:cNvGraphicFramePr>
+                  <a:graphic>
+                    <a:graphicData uri="http://schemas.openxmlformats.org/drawingml/2006/picture">
+                      <pic:pic>
+                        <pic:nvPicPr>
+                          <pic:cNvPr id="0" name="dlg_doc_expire.png"/>
+                          <pic:cNvPicPr/>
+                        </pic:nvPicPr>
+                        <pic:blipFill>
+                          <a:blip r:embed="rId12"/>
+                          <a:stretch>
+                            <a:fillRect/>
+                          </a:stretch>
+                        </pic:blipFill>
+                        <pic:spPr>
+                          <a:xfrm>
+                            <a:off x="0" y="0"/>
+                            <a:ext cx="1417320" cy="1915297"/>
+                          </a:xfrm>
+                          <a:prstGeom prst="rect"/>
+                        </pic:spPr>
+                      </pic:pic>
+                    </a:graphicData>
+                  </a:graphic>
+                </wp:inline>
+              </w:drawing>
+            </w:r>
+          </w:p>
+          <w:p>
+            <w:pPr>
+              <w:jc w:val="center"/>
+            </w:pPr>
+            <w:r>
+              <w:rPr>
+                <w:rFonts w:ascii="Arial" w:hAnsi="Arial"/>
+                <w:color w:val="666666"/>
+                <w:sz w:val="16"/>
+              </w:rPr>
+              <w:t>Документ истекает</w:t>
+            </w:r>
+          </w:p>
+        </w:tc>
+      </w:tr>
+      <w:tr>
+        <w:tc>
+          <w:tcPr>
+            <w:tcW w:type="dxa" w:w="2160"/>
+          </w:tcPr>
+          <w:p>
+            <w:r/>
+            <w:r>
+              <w:drawing>
+                <wp:inline xmlns:a="http://schemas.openxmlformats.org/drawingml/2006/main" xmlns:pic="http://schemas.openxmlformats.org/drawingml/2006/picture">
+                  <wp:extent cx="1417320" cy="1815941"/>
+                  <wp:docPr id="5" name="Picture 5"/>
+                  <wp:cNvGraphicFramePr>
+                    <a:graphicFrameLocks noChangeAspect="1"/>
+                  </wp:cNvGraphicFramePr>
+                  <a:graphic>
+                    <a:graphicData uri="http://schemas.openxmlformats.org/drawingml/2006/picture">
+                      <pic:pic>
+                        <pic:nvPicPr>
+                          <pic:cNvPr id="0" name="dlg_data_update.png"/>
+                          <pic:cNvPicPr/>
+                        </pic:nvPicPr>
+                        <pic:blipFill>
+                          <a:blip r:embed="rId13"/>
+                          <a:stretch>
+                            <a:fillRect/>
+                          </a:stretch>
+                        </pic:blipFill>
+                        <pic:spPr>
+                          <a:xfrm>
+                            <a:off x="0" y="0"/>
+                            <a:ext cx="1417320" cy="1815941"/>
+                          </a:xfrm>
+                          <a:prstGeom prst="rect"/>
+                        </pic:spPr>
+                      </pic:pic>
+                    </a:graphicData>
+                  </a:graphic>
+                </wp:inline>
+              </w:drawing>
+            </w:r>
+          </w:p>
+          <w:p>
+            <w:pPr>
+              <w:jc w:val="center"/>
+            </w:pPr>
+            <w:r>
+              <w:rPr>
+                <w:rFonts w:ascii="Arial" w:hAnsi="Arial"/>
+                <w:color w:val="666666"/>
+                <w:sz w:val="16"/>
+              </w:rPr>
+              <w:t>Обновление данных</w:t>
+            </w:r>
+          </w:p>
+        </w:tc>
+        <w:tc>
+          <w:tcPr>
+            <w:tcW w:type="dxa" w:w="2160"/>
+          </w:tcPr>
+          <w:p>
+            <w:r/>
+            <w:r>
+              <w:drawing>
+                <wp:inline xmlns:a="http://schemas.openxmlformats.org/drawingml/2006/main" xmlns:pic="http://schemas.openxmlformats.org/drawingml/2006/picture">
+                  <wp:extent cx="1417320" cy="2910840"/>
+                  <wp:docPr id="6" name="Picture 6"/>
+                  <wp:cNvGraphicFramePr>
+                    <a:graphicFrameLocks noChangeAspect="1"/>
+                  </wp:cNvGraphicFramePr>
+                  <a:graphic>
+                    <a:graphicData uri="http://schemas.openxmlformats.org/drawingml/2006/picture">
+                      <pic:pic>
+                        <pic:nvPicPr>
+                          <pic:cNvPr id="0" name="dlg_selfie.png"/>
+                          <pic:cNvPicPr/>
+                        </pic:nvPicPr>
+                        <pic:blipFill>
+                          <a:blip r:embed="rId14"/>
+                          <a:stretch>
+                            <a:fillRect/>
+                          </a:stretch>
+                        </pic:blipFill>
+                        <pic:spPr>
+                          <a:xfrm>
+                            <a:off x="0" y="0"/>
+                            <a:ext cx="1417320" cy="2910840"/>
+                          </a:xfrm>
+                          <a:prstGeom prst="rect"/>
+                        </pic:spPr>
+                      </pic:pic>
+                    </a:graphicData>
+                  </a:graphic>
+                </wp:inline>
+              </w:drawing>
+            </w:r>
+          </w:p>
+          <w:p>
+            <w:pPr>
+              <w:jc w:val="center"/>
+            </w:pPr>
+            <w:r>
+              <w:rPr>
+                <w:rFonts w:ascii="Arial" w:hAnsi="Arial"/>
+                <w:color w:val="666666"/>
+                <w:sz w:val="16"/>
+              </w:rPr>
+              <w:t>Верификация — селфи</w:t>
+            </w:r>
+          </w:p>
+        </w:tc>
+        <w:tc>
+          <w:tcPr>
+            <w:tcW w:type="dxa" w:w="2160"/>
+          </w:tcPr>
+          <w:p>
+            <w:r/>
+            <w:r>
+              <w:drawing>
+                <wp:inline xmlns:a="http://schemas.openxmlformats.org/drawingml/2006/main" xmlns:pic="http://schemas.openxmlformats.org/drawingml/2006/picture">
+                  <wp:extent cx="1417320" cy="2910840"/>
+                  <wp:docPr id="7" name="Picture 7"/>
+                  <wp:cNvGraphicFramePr>
+                    <a:graphicFrameLocks noChangeAspect="1"/>
+                  </wp:cNvGraphicFramePr>
+                  <a:graphic>
+                    <a:graphicData uri="http://schemas.openxmlformats.org/drawingml/2006/picture">
+                      <pic:pic>
+                        <pic:nvPicPr>
+                          <pic:cNvPr id="0" name="dlg_cam_denied.png"/>
+                          <pic:cNvPicPr/>
+                        </pic:nvPicPr>
+                        <pic:blipFill>
+                          <a:blip r:embed="rId15"/>
+                          <a:stretch>
+                            <a:fillRect/>
+                          </a:stretch>
+                        </pic:blipFill>
+                        <pic:spPr>
+                          <a:xfrm>
+                            <a:off x="0" y="0"/>
+                            <a:ext cx="1417320" cy="2910840"/>
+                          </a:xfrm>
+                          <a:prstGeom prst="rect"/>
+                        </pic:spPr>
+                      </pic:pic>
+                    </a:graphicData>
+                  </a:graphic>
+                </wp:inline>
+              </w:drawing>
+            </w:r>
+          </w:p>
+          <w:p>
+            <w:pPr>
+              <w:jc w:val="center"/>
+            </w:pPr>
+            <w:r>
+              <w:rPr>
+                <w:rFonts w:ascii="Arial" w:hAnsi="Arial"/>
+                <w:color w:val="666666"/>
+                <w:sz w:val="16"/>
+              </w:rPr>
+              <w:t>Доступ к камере запрещён</w:t>
+            </w:r>
+          </w:p>
+        </w:tc>
+        <w:tc>
+          <w:tcPr>
+            <w:tcW w:type="dxa" w:w="2160"/>
+          </w:tcPr>
+          <w:p>
+            <w:r/>
+            <w:r>
+              <w:drawing>
+                <wp:inline xmlns:a="http://schemas.openxmlformats.org/drawingml/2006/main" xmlns:pic="http://schemas.openxmlformats.org/drawingml/2006/picture">
+                  <wp:extent cx="1417320" cy="2910840"/>
+                  <wp:docPr id="8" name="Picture 8"/>
+                  <wp:cNvGraphicFramePr>
+                    <a:graphicFrameLocks noChangeAspect="1"/>
+                  </wp:cNvGraphicFramePr>
+                  <a:graphic>
+                    <a:graphicData uri="http://schemas.openxmlformats.org/drawingml/2006/picture">
+                      <pic:pic>
+                        <pic:nvPicPr>
+                          <pic:cNvPr id="0" name="dlg_verif_error.png"/>
+                          <pic:cNvPicPr/>
+                        </pic:nvPicPr>
+                        <pic:blipFill>
+                          <a:blip r:embed="rId16"/>
+                          <a:stretch>
+                            <a:fillRect/>
+                          </a:stretch>
+                        </pic:blipFill>
+                        <pic:spPr>
+                          <a:xfrm>
+                            <a:off x="0" y="0"/>
+                            <a:ext cx="1417320" cy="2910840"/>
+                          </a:xfrm>
+                          <a:prstGeom prst="rect"/>
+                        </pic:spPr>
+                      </pic:pic>
+                    </a:graphicData>
+                  </a:graphic>
+                </wp:inline>
+              </w:drawing>
+            </w:r>
+          </w:p>
+          <w:p>
+            <w:pPr>
+              <w:jc w:val="center"/>
+            </w:pPr>
+            <w:r>
+              <w:rPr>
+                <w:rFonts w:ascii="Arial" w:hAnsi="Arial"/>
+                <w:color w:val="666666"/>
+                <w:sz w:val="16"/>
+              </w:rPr>
+              <w:t>Ошибка верификации</w:t>
+            </w:r>
+          </w:p>
+        </w:tc>
+      </w:tr>
+      <w:tr>
+        <w:tc>
+          <w:tcPr>
+            <w:tcW w:type="dxa" w:w="2160"/>
+          </w:tcPr>
+          <w:p>
+            <w:r/>
+            <w:r>
+              <w:drawing>
+                <wp:inline xmlns:a="http://schemas.openxmlformats.org/drawingml/2006/main" xmlns:pic="http://schemas.openxmlformats.org/drawingml/2006/picture">
+                  <wp:extent cx="1417320" cy="646047"/>
+                  <wp:docPr id="9" name="Picture 9"/>
+                  <wp:cNvGraphicFramePr>
+                    <a:graphicFrameLocks noChangeAspect="1"/>
+                  </wp:cNvGraphicFramePr>
+                  <a:graphic>
+                    <a:graphicData uri="http://schemas.openxmlformats.org/drawingml/2006/picture">
+                      <pic:pic>
+                        <pic:nvPicPr>
+                          <pic:cNvPr id="0" name="dlg_session.png"/>
+                          <pic:cNvPicPr/>
+                        </pic:nvPicPr>
+                        <pic:blipFill>
+                          <a:blip r:embed="rId17"/>
+                          <a:stretch>
+                            <a:fillRect/>
+                          </a:stretch>
+                        </pic:blipFill>
+                        <pic:spPr>
+                          <a:xfrm>
+                            <a:off x="0" y="0"/>
+                            <a:ext cx="1417320" cy="646047"/>
+                          </a:xfrm>
+                          <a:prstGeom prst="rect"/>
+                        </pic:spPr>
+                      </pic:pic>
+                    </a:graphicData>
+                  </a:graphic>
+                </wp:inline>
+              </w:drawing>
+            </w:r>
+          </w:p>
+          <w:p>
+            <w:pPr>
+              <w:jc w:val="center"/>
+            </w:pPr>
+            <w:r>
+              <w:rPr>
+                <w:rFonts w:ascii="Arial" w:hAnsi="Arial"/>
+                <w:color w:val="666666"/>
+                <w:sz w:val="16"/>
+              </w:rPr>
+              <w:t>Лимит сессии</w:t>
+            </w:r>
+          </w:p>
+        </w:tc>
+        <w:tc>
+          <w:tcPr>
+            <w:tcW w:type="dxa" w:w="2160"/>
+          </w:tcPr>
+          <w:p>
+            <w:r/>
+            <w:r>
+              <w:drawing>
+                <wp:inline xmlns:a="http://schemas.openxmlformats.org/drawingml/2006/main" xmlns:pic="http://schemas.openxmlformats.org/drawingml/2006/picture">
+                  <wp:extent cx="1417320" cy="3086100"/>
+                  <wp:docPr id="10" name="Picture 10"/>
+                  <wp:cNvGraphicFramePr>
+                    <a:graphicFrameLocks noChangeAspect="1"/>
+                  </wp:cNvGraphicFramePr>
+                  <a:graphic>
+                    <a:graphicData uri="http://schemas.openxmlformats.org/drawingml/2006/picture">
+                      <pic:pic>
+                        <pic:nvPicPr>
+                          <pic:cNvPr id="0" name="age_ingame.png"/>
+                          <pic:cNvPicPr/>
+                        </pic:nvPicPr>
+                        <pic:blipFill>
+                          <a:blip r:embed="rId18"/>
+                          <a:stretch>
+                            <a:fillRect/>
+                          </a:stretch>
+                        </pic:blipFill>
+                        <pic:spPr>
+                          <a:xfrm>
+                            <a:off x="0" y="0"/>
+                            <a:ext cx="1417320" cy="3086100"/>
+                          </a:xfrm>
+                          <a:prstGeom prst="rect"/>
+                        </pic:spPr>
+                      </pic:pic>
+                    </a:graphicData>
+                  </a:graphic>
+                </wp:inline>
+              </w:drawing>
+            </w:r>
+          </w:p>
+          <w:p>
+            <w:pPr>
+              <w:jc w:val="center"/>
+            </w:pPr>
+            <w:r>
+              <w:rPr>
+                <w:rFonts w:ascii="Arial" w:hAnsi="Arial"/>
+                <w:color w:val="666666"/>
+                <w:sz w:val="16"/>
+              </w:rPr>
+              <w:t>Проверка возраста (в игре)</w:t>
+            </w:r>
+          </w:p>
+        </w:tc>
+        <w:tc>
+          <w:tcPr>
+            <w:tcW w:type="dxa" w:w="2160"/>
+          </w:tcPr>
+          <w:p/>
+        </w:tc>
+        <w:tc>
+          <w:tcPr>
+            <w:tcW w:type="dxa" w:w="2160"/>
+          </w:tcPr>
+          <w:p/>
+        </w:tc>
       </w:tr>
     </w:tbl>
     <w:p>
@@ -556,10 +680,10 @@
         <w:rPr>
           <w:rFonts w:ascii="Arial" w:hAnsi="Arial"/>
           <w:b/>
-          <w:i w:val="0"/>
+          <w:color w:val="555555"/>
           <w:sz w:val="20"/>
         </w:rPr>
-        <w:t>Вариант БЛОКИРУЮЩИЙ:</w:t>
+        <w:t>БЛОКИРУЮЩИЙ</w:t>
       </w:r>
     </w:p>
     <w:tbl>
@@ -584,8 +708,8 @@
             <w:r>
               <w:drawing>
                 <wp:inline xmlns:a="http://schemas.openxmlformats.org/drawingml/2006/main" xmlns:pic="http://schemas.openxmlformats.org/drawingml/2006/picture">
-                  <wp:extent cx="1325880" cy="1001174"/>
-                  <wp:docPr id="9" name="Picture 9"/>
+                  <wp:extent cx="1417320" cy="2910840"/>
+                  <wp:docPr id="11" name="Picture 11"/>
                   <wp:cNvGraphicFramePr>
                     <a:graphicFrameLocks noChangeAspect="1"/>
                   </wp:cNvGraphicFramePr>
@@ -593,11 +717,11 @@
                     <a:graphicData uri="http://schemas.openxmlformats.org/drawingml/2006/picture">
                       <pic:pic>
                         <pic:nvPicPr>
-                          <pic:cNvPr id="0" name="M-03.png"/>
+                          <pic:cNvPr id="0" name="dlg_pw_pt.png"/>
                           <pic:cNvPicPr/>
                         </pic:nvPicPr>
                         <pic:blipFill>
-                          <a:blip r:embed="rId17"/>
+                          <a:blip r:embed="rId19"/>
                           <a:stretch>
                             <a:fillRect/>
                           </a:stretch>
@@ -605,7 +729,7 @@
                         <pic:spPr>
                           <a:xfrm>
                             <a:off x="0" y="0"/>
-                            <a:ext cx="1325880" cy="1001174"/>
+                            <a:ext cx="1417320" cy="2910840"/>
                           </a:xfrm>
                           <a:prstGeom prst="rect"/>
                         </pic:spPr>
@@ -626,7 +750,7 @@
                 <w:color w:val="666666"/>
                 <w:sz w:val="16"/>
               </w:rPr>
-              <w:t>Жёсткая блокировка SIGAP</w:t>
+              <w:t>Смена пароля (PT)</w:t>
             </w:r>
           </w:p>
         </w:tc>
@@ -639,8 +763,8 @@
             <w:r>
               <w:drawing>
                 <wp:inline xmlns:a="http://schemas.openxmlformats.org/drawingml/2006/main" xmlns:pic="http://schemas.openxmlformats.org/drawingml/2006/picture">
-                  <wp:extent cx="1325880" cy="606759"/>
-                  <wp:docPr id="10" name="Picture 10"/>
+                  <wp:extent cx="1417320" cy="2910840"/>
+                  <wp:docPr id="12" name="Picture 12"/>
                   <wp:cNvGraphicFramePr>
                     <a:graphicFrameLocks noChangeAspect="1"/>
                   </wp:cNvGraphicFramePr>
@@ -648,11 +772,11 @@
                     <a:graphicData uri="http://schemas.openxmlformats.org/drawingml/2006/picture">
                       <pic:pic>
                         <pic:nvPicPr>
-                          <pic:cNvPr id="0" name="M-06.png"/>
+                          <pic:cNvPr id="0" name="dlg_pw_es.png"/>
                           <pic:cNvPicPr/>
                         </pic:nvPicPr>
                         <pic:blipFill>
-                          <a:blip r:embed="rId18"/>
+                          <a:blip r:embed="rId20"/>
                           <a:stretch>
                             <a:fillRect/>
                           </a:stretch>
@@ -660,7 +784,7 @@
                         <pic:spPr>
                           <a:xfrm>
                             <a:off x="0" y="0"/>
-                            <a:ext cx="1325880" cy="606759"/>
+                            <a:ext cx="1417320" cy="2910840"/>
                           </a:xfrm>
                           <a:prstGeom prst="rect"/>
                         </pic:spPr>
@@ -681,7 +805,7 @@
                 <w:color w:val="666666"/>
                 <w:sz w:val="16"/>
               </w:rPr>
-              <w:t>Лимит времени</w:t>
+              <w:t>Смена пароля (ES)</w:t>
             </w:r>
           </w:p>
         </w:tc>
@@ -694,8 +818,8 @@
             <w:r>
               <w:drawing>
                 <wp:inline xmlns:a="http://schemas.openxmlformats.org/drawingml/2006/main" xmlns:pic="http://schemas.openxmlformats.org/drawingml/2006/picture">
-                  <wp:extent cx="1325880" cy="1120847"/>
-                  <wp:docPr id="11" name="Picture 11"/>
+                  <wp:extent cx="1417320" cy="3138351"/>
+                  <wp:docPr id="13" name="Picture 13"/>
                   <wp:cNvGraphicFramePr>
                     <a:graphicFrameLocks noChangeAspect="1"/>
                   </wp:cNvGraphicFramePr>
@@ -703,11 +827,11 @@
                     <a:graphicData uri="http://schemas.openxmlformats.org/drawingml/2006/picture">
                       <pic:pic>
                         <pic:nvPicPr>
-                          <pic:cNvPr id="0" name="M-10.png"/>
+                          <pic:cNvPr id="0" name="dlg_blocked_es.png"/>
                           <pic:cNvPicPr/>
                         </pic:nvPicPr>
                         <pic:blipFill>
-                          <a:blip r:embed="rId19"/>
+                          <a:blip r:embed="rId21"/>
                           <a:stretch>
                             <a:fillRect/>
                           </a:stretch>
@@ -715,7 +839,7 @@
                         <pic:spPr>
                           <a:xfrm>
                             <a:off x="0" y="0"/>
-                            <a:ext cx="1325880" cy="1120847"/>
+                            <a:ext cx="1417320" cy="3138351"/>
                           </a:xfrm>
                           <a:prstGeom prst="rect"/>
                         </pic:spPr>
@@ -736,7 +860,7 @@
                 <w:color w:val="666666"/>
                 <w:sz w:val="16"/>
               </w:rPr>
-              <w:t>Смена пароля</w:t>
+              <w:t>Пользователь заблокирован</w:t>
             </w:r>
           </w:p>
         </w:tc>
@@ -749,8 +873,8 @@
             <w:r>
               <w:drawing>
                 <wp:inline xmlns:a="http://schemas.openxmlformats.org/drawingml/2006/main" xmlns:pic="http://schemas.openxmlformats.org/drawingml/2006/picture">
-                  <wp:extent cx="1325880" cy="1325880"/>
-                  <wp:docPr id="12" name="Picture 12"/>
+                  <wp:extent cx="1417320" cy="2926574"/>
+                  <wp:docPr id="14" name="Picture 14"/>
                   <wp:cNvGraphicFramePr>
                     <a:graphicFrameLocks noChangeAspect="1"/>
                   </wp:cNvGraphicFramePr>
@@ -758,11 +882,11 @@
                     <a:graphicData uri="http://schemas.openxmlformats.org/drawingml/2006/picture">
                       <pic:pic>
                         <pic:nvPicPr>
-                          <pic:cNvPr id="0" name="M-12.png"/>
+                          <pic:cNvPr id="0" name="dlg_cpf.png"/>
                           <pic:cNvPicPr/>
                         </pic:nvPicPr>
                         <pic:blipFill>
-                          <a:blip r:embed="rId20"/>
+                          <a:blip r:embed="rId22"/>
                           <a:stretch>
                             <a:fillRect/>
                           </a:stretch>
@@ -770,7 +894,7 @@
                         <pic:spPr>
                           <a:xfrm>
                             <a:off x="0" y="0"/>
-                            <a:ext cx="1325880" cy="1325880"/>
+                            <a:ext cx="1417320" cy="2926574"/>
                           </a:xfrm>
                           <a:prstGeom prst="rect"/>
                         </pic:spPr>
@@ -791,7 +915,7 @@
                 <w:color w:val="666666"/>
                 <w:sz w:val="16"/>
               </w:rPr>
-              <w:t>Обязательные лимиты</w:t>
+              <w:t>CPF / Bolsa Família (SIGAP)</w:t>
             </w:r>
           </w:p>
         </w:tc>
@@ -802,10 +926,10 @@
         <w:rPr>
           <w:rFonts w:ascii="Arial" w:hAnsi="Arial"/>
           <w:b/>
-          <w:i w:val="0"/>
+          <w:color w:val="555555"/>
           <w:sz w:val="20"/>
         </w:rPr>
-        <w:t>Вариант СОБЫТИЕ:</w:t>
+        <w:t>СОБЫТИЕ</w:t>
       </w:r>
     </w:p>
     <w:tbl>
@@ -830,8 +954,8 @@
             <w:r>
               <w:drawing>
                 <wp:inline xmlns:a="http://schemas.openxmlformats.org/drawingml/2006/main" xmlns:pic="http://schemas.openxmlformats.org/drawingml/2006/picture">
-                  <wp:extent cx="1325880" cy="1119918"/>
-                  <wp:docPr id="13" name="Picture 13"/>
+                  <wp:extent cx="1417320" cy="3102782"/>
+                  <wp:docPr id="15" name="Picture 15"/>
                   <wp:cNvGraphicFramePr>
                     <a:graphicFrameLocks noChangeAspect="1"/>
                   </wp:cNvGraphicFramePr>
@@ -839,11 +963,11 @@
                     <a:graphicData uri="http://schemas.openxmlformats.org/drawingml/2006/picture">
                       <pic:pic>
                         <pic:nvPicPr>
-                          <pic:cNvPr id="0" name="E-01.png"/>
+                          <pic:cNvPr id="0" name="evt_level.png"/>
                           <pic:cNvPicPr/>
                         </pic:nvPicPr>
                         <pic:blipFill>
-                          <a:blip r:embed="rId21"/>
+                          <a:blip r:embed="rId23"/>
                           <a:stretch>
                             <a:fillRect/>
                           </a:stretch>
@@ -851,7 +975,7 @@
                         <pic:spPr>
                           <a:xfrm>
                             <a:off x="0" y="0"/>
-                            <a:ext cx="1325880" cy="1119918"/>
+                            <a:ext cx="1417320" cy="3102782"/>
                           </a:xfrm>
                           <a:prstGeom prst="rect"/>
                         </pic:spPr>
@@ -872,7 +996,7 @@
                 <w:color w:val="666666"/>
                 <w:sz w:val="16"/>
               </w:rPr>
-              <w:t>Уровень</w:t>
+              <w:t>Уровень 1 / бонус</w:t>
             </w:r>
           </w:p>
         </w:tc>
@@ -885,8 +1009,8 @@
             <w:r>
               <w:drawing>
                 <wp:inline xmlns:a="http://schemas.openxmlformats.org/drawingml/2006/main" xmlns:pic="http://schemas.openxmlformats.org/drawingml/2006/picture">
-                  <wp:extent cx="1325880" cy="717678"/>
-                  <wp:docPr id="14" name="Picture 14"/>
+                  <wp:extent cx="1417320" cy="1708445"/>
+                  <wp:docPr id="16" name="Picture 16"/>
                   <wp:cNvGraphicFramePr>
                     <a:graphicFrameLocks noChangeAspect="1"/>
                   </wp:cNvGraphicFramePr>
@@ -894,11 +1018,11 @@
                     <a:graphicData uri="http://schemas.openxmlformats.org/drawingml/2006/picture">
                       <pic:pic>
                         <pic:nvPicPr>
-                          <pic:cNvPr id="0" name="E-02.png"/>
+                          <pic:cNvPr id="0" name="evt_coupons.png"/>
                           <pic:cNvPicPr/>
                         </pic:nvPicPr>
                         <pic:blipFill>
-                          <a:blip r:embed="rId22"/>
+                          <a:blip r:embed="rId24"/>
                           <a:stretch>
                             <a:fillRect/>
                           </a:stretch>
@@ -906,7 +1030,7 @@
                         <pic:spPr>
                           <a:xfrm>
                             <a:off x="0" y="0"/>
-                            <a:ext cx="1325880" cy="717678"/>
+                            <a:ext cx="1417320" cy="1708445"/>
                           </a:xfrm>
                           <a:prstGeom prst="rect"/>
                         </pic:spPr>
@@ -927,7 +1051,7 @@
                 <w:color w:val="666666"/>
                 <w:sz w:val="16"/>
               </w:rPr>
-              <w:t>VIP</w:t>
+              <w:t>10 купонов (промо)</w:t>
             </w:r>
           </w:p>
         </w:tc>
@@ -940,8 +1064,8 @@
             <w:r>
               <w:drawing>
                 <wp:inline xmlns:a="http://schemas.openxmlformats.org/drawingml/2006/main" xmlns:pic="http://schemas.openxmlformats.org/drawingml/2006/picture">
-                  <wp:extent cx="1325880" cy="980599"/>
-                  <wp:docPr id="15" name="Picture 15"/>
+                  <wp:extent cx="1417320" cy="1341567"/>
+                  <wp:docPr id="17" name="Picture 17"/>
                   <wp:cNvGraphicFramePr>
                     <a:graphicFrameLocks noChangeAspect="1"/>
                   </wp:cNvGraphicFramePr>
@@ -949,11 +1073,11 @@
                     <a:graphicData uri="http://schemas.openxmlformats.org/drawingml/2006/picture">
                       <pic:pic>
                         <pic:nvPicPr>
-                          <pic:cNvPr id="0" name="E-03.png"/>
+                          <pic:cNvPr id="0" name="evt_promo.png"/>
                           <pic:cNvPicPr/>
                         </pic:nvPicPr>
                         <pic:blipFill>
-                          <a:blip r:embed="rId23"/>
+                          <a:blip r:embed="rId25"/>
                           <a:stretch>
                             <a:fillRect/>
                           </a:stretch>
@@ -961,7 +1085,7 @@
                         <pic:spPr>
                           <a:xfrm>
                             <a:off x="0" y="0"/>
-                            <a:ext cx="1325880" cy="980599"/>
+                            <a:ext cx="1417320" cy="1341567"/>
                           </a:xfrm>
                           <a:prstGeom prst="rect"/>
                         </pic:spPr>
@@ -982,7 +1106,7 @@
                 <w:color w:val="666666"/>
                 <w:sz w:val="16"/>
               </w:rPr>
-              <w:t>Выигрыш</w:t>
+              <w:t>Промокод активирован</w:t>
             </w:r>
           </w:p>
         </w:tc>
@@ -995,8 +1119,8 @@
             <w:r>
               <w:drawing>
                 <wp:inline xmlns:a="http://schemas.openxmlformats.org/drawingml/2006/main" xmlns:pic="http://schemas.openxmlformats.org/drawingml/2006/picture">
-                  <wp:extent cx="1325880" cy="997343"/>
-                  <wp:docPr id="16" name="Picture 16"/>
+                  <wp:extent cx="1417320" cy="2910840"/>
+                  <wp:docPr id="18" name="Picture 18"/>
                   <wp:cNvGraphicFramePr>
                     <a:graphicFrameLocks noChangeAspect="1"/>
                   </wp:cNvGraphicFramePr>
@@ -1004,11 +1128,11 @@
                     <a:graphicData uri="http://schemas.openxmlformats.org/drawingml/2006/picture">
                       <pic:pic>
                         <pic:nvPicPr>
-                          <pic:cNvPr id="0" name="E-04.png"/>
+                          <pic:cNvPr id="0" name="evt_pw_changed.png"/>
                           <pic:cNvPicPr/>
                         </pic:nvPicPr>
                         <pic:blipFill>
-                          <a:blip r:embed="rId24"/>
+                          <a:blip r:embed="rId26"/>
                           <a:stretch>
                             <a:fillRect/>
                           </a:stretch>
@@ -1016,7 +1140,7 @@
                         <pic:spPr>
                           <a:xfrm>
                             <a:off x="0" y="0"/>
-                            <a:ext cx="1325880" cy="997343"/>
+                            <a:ext cx="1417320" cy="2910840"/>
                           </a:xfrm>
                           <a:prstGeom prst="rect"/>
                         </pic:spPr>
@@ -1037,133 +1161,9 @@
                 <w:color w:val="666666"/>
                 <w:sz w:val="16"/>
               </w:rPr>
-              <w:t>Реферал</w:t>
+              <w:t>Пароль изменён</w:t>
             </w:r>
           </w:p>
-        </w:tc>
-      </w:tr>
-      <w:tr>
-        <w:tc>
-          <w:tcPr>
-            <w:tcW w:type="dxa" w:w="2160"/>
-          </w:tcPr>
-          <w:p>
-            <w:r/>
-            <w:r>
-              <w:drawing>
-                <wp:inline xmlns:a="http://schemas.openxmlformats.org/drawingml/2006/main" xmlns:pic="http://schemas.openxmlformats.org/drawingml/2006/picture">
-                  <wp:extent cx="1325880" cy="1166774"/>
-                  <wp:docPr id="17" name="Picture 17"/>
-                  <wp:cNvGraphicFramePr>
-                    <a:graphicFrameLocks noChangeAspect="1"/>
-                  </wp:cNvGraphicFramePr>
-                  <a:graphic>
-                    <a:graphicData uri="http://schemas.openxmlformats.org/drawingml/2006/picture">
-                      <pic:pic>
-                        <pic:nvPicPr>
-                          <pic:cNvPr id="0" name="E-05.png"/>
-                          <pic:cNvPicPr/>
-                        </pic:nvPicPr>
-                        <pic:blipFill>
-                          <a:blip r:embed="rId25"/>
-                          <a:stretch>
-                            <a:fillRect/>
-                          </a:stretch>
-                        </pic:blipFill>
-                        <pic:spPr>
-                          <a:xfrm>
-                            <a:off x="0" y="0"/>
-                            <a:ext cx="1325880" cy="1166774"/>
-                          </a:xfrm>
-                          <a:prstGeom prst="rect"/>
-                        </pic:spPr>
-                      </pic:pic>
-                    </a:graphicData>
-                  </a:graphic>
-                </wp:inline>
-              </w:drawing>
-            </w:r>
-          </w:p>
-          <w:p>
-            <w:pPr>
-              <w:jc w:val="center"/>
-            </w:pPr>
-            <w:r>
-              <w:rPr>
-                <w:rFonts w:ascii="Arial" w:hAnsi="Arial"/>
-                <w:color w:val="666666"/>
-                <w:sz w:val="16"/>
-              </w:rPr>
-              <w:t>Выбор бонуса</w:t>
-            </w:r>
-          </w:p>
-        </w:tc>
-        <w:tc>
-          <w:tcPr>
-            <w:tcW w:type="dxa" w:w="2160"/>
-          </w:tcPr>
-          <w:p>
-            <w:r/>
-            <w:r>
-              <w:drawing>
-                <wp:inline xmlns:a="http://schemas.openxmlformats.org/drawingml/2006/main" xmlns:pic="http://schemas.openxmlformats.org/drawingml/2006/picture">
-                  <wp:extent cx="1325880" cy="1249387"/>
-                  <wp:docPr id="18" name="Picture 18"/>
-                  <wp:cNvGraphicFramePr>
-                    <a:graphicFrameLocks noChangeAspect="1"/>
-                  </wp:cNvGraphicFramePr>
-                  <a:graphic>
-                    <a:graphicData uri="http://schemas.openxmlformats.org/drawingml/2006/picture">
-                      <pic:pic>
-                        <pic:nvPicPr>
-                          <pic:cNvPr id="0" name="E-07.png"/>
-                          <pic:cNvPicPr/>
-                        </pic:nvPicPr>
-                        <pic:blipFill>
-                          <a:blip r:embed="rId26"/>
-                          <a:stretch>
-                            <a:fillRect/>
-                          </a:stretch>
-                        </pic:blipFill>
-                        <pic:spPr>
-                          <a:xfrm>
-                            <a:off x="0" y="0"/>
-                            <a:ext cx="1325880" cy="1249387"/>
-                          </a:xfrm>
-                          <a:prstGeom prst="rect"/>
-                        </pic:spPr>
-                      </pic:pic>
-                    </a:graphicData>
-                  </a:graphic>
-                </wp:inline>
-              </w:drawing>
-            </w:r>
-          </w:p>
-          <w:p>
-            <w:pPr>
-              <w:jc w:val="center"/>
-            </w:pPr>
-            <w:r>
-              <w:rPr>
-                <w:rFonts w:ascii="Arial" w:hAnsi="Arial"/>
-                <w:color w:val="666666"/>
-                <w:sz w:val="16"/>
-              </w:rPr>
-              <w:t>Промокод</w:t>
-            </w:r>
-          </w:p>
-        </w:tc>
-        <w:tc>
-          <w:tcPr>
-            <w:tcW w:type="dxa" w:w="2160"/>
-          </w:tcPr>
-          <w:p/>
-        </w:tc>
-        <w:tc>
-          <w:tcPr>
-            <w:tcW w:type="dxa" w:w="2160"/>
-          </w:tcPr>
-          <w:p/>
         </w:tc>
       </w:tr>
     </w:tbl>
@@ -1197,34 +1197,143 @@
         <w:t>Дополнительное действие или выбор, связанный с текущим экраном.</w:t>
       </w:r>
     </w:p>
-    <w:p>
-      <w:r>
-        <w:rPr>
-          <w:rFonts w:ascii="Arial" w:hAnsi="Arial"/>
-          <w:b/>
-          <w:sz w:val="21"/>
-        </w:rPr>
-        <w:t xml:space="preserve">Примеры: </w:t>
-      </w:r>
-      <w:r>
-        <w:rPr>
-          <w:rFonts w:ascii="Arial" w:hAnsi="Arial"/>
-          <w:sz w:val="21"/>
-        </w:rPr>
-        <w:t>Быстрое пополнение счёта (Fast PIX), выбор платёжного метода, подтверждение лимитов</w:t>
-      </w:r>
-    </w:p>
-    <w:p>
-      <w:r>
-        <w:rPr>
-          <w:rFonts w:ascii="Arial" w:hAnsi="Arial"/>
-          <w:i/>
-          <w:color w:val="666666"/>
-          <w:sz w:val="19"/>
-        </w:rPr>
-        <w:t>🖼 Скриншоты — на Figma-борде. Пришли борд файлом (PDF/PNG) — вставлю автоматически.</w:t>
-      </w:r>
-    </w:p>
+    <w:tbl>
+      <w:tblPr>
+        <w:tblW w:type="auto" w:w="0"/>
+        <w:jc w:val="center"/>
+        <w:tblLook w:firstColumn="1" w:firstRow="1" w:lastColumn="0" w:lastRow="0" w:noHBand="0" w:noVBand="1" w:val="04A0"/>
+      </w:tblPr>
+      <w:tblGrid>
+        <w:gridCol w:w="2160"/>
+        <w:gridCol w:w="2160"/>
+        <w:gridCol w:w="2160"/>
+        <w:gridCol w:w="2160"/>
+      </w:tblGrid>
+      <w:tr>
+        <w:tc>
+          <w:tcPr>
+            <w:tcW w:type="dxa" w:w="2160"/>
+          </w:tcPr>
+          <w:p>
+            <w:r/>
+            <w:r>
+              <w:drawing>
+                <wp:inline xmlns:a="http://schemas.openxmlformats.org/drawingml/2006/main" xmlns:pic="http://schemas.openxmlformats.org/drawingml/2006/picture">
+                  <wp:extent cx="1417320" cy="2918913"/>
+                  <wp:docPr id="19" name="Picture 19"/>
+                  <wp:cNvGraphicFramePr>
+                    <a:graphicFrameLocks noChangeAspect="1"/>
+                  </wp:cNvGraphicFramePr>
+                  <a:graphic>
+                    <a:graphicData uri="http://schemas.openxmlformats.org/drawingml/2006/picture">
+                      <pic:pic>
+                        <pic:nvPicPr>
+                          <pic:cNvPr id="0" name="sheet_limits.png"/>
+                          <pic:cNvPicPr/>
+                        </pic:nvPicPr>
+                        <pic:blipFill>
+                          <a:blip r:embed="rId27"/>
+                          <a:stretch>
+                            <a:fillRect/>
+                          </a:stretch>
+                        </pic:blipFill>
+                        <pic:spPr>
+                          <a:xfrm>
+                            <a:off x="0" y="0"/>
+                            <a:ext cx="1417320" cy="2918913"/>
+                          </a:xfrm>
+                          <a:prstGeom prst="rect"/>
+                        </pic:spPr>
+                      </pic:pic>
+                    </a:graphicData>
+                  </a:graphic>
+                </wp:inline>
+              </w:drawing>
+            </w:r>
+          </w:p>
+          <w:p>
+            <w:pPr>
+              <w:jc w:val="center"/>
+            </w:pPr>
+            <w:r>
+              <w:rPr>
+                <w:rFonts w:ascii="Arial" w:hAnsi="Arial"/>
+                <w:color w:val="666666"/>
+                <w:sz w:val="16"/>
+              </w:rPr>
+              <w:t>Confirmar limites</w:t>
+            </w:r>
+          </w:p>
+        </w:tc>
+        <w:tc>
+          <w:tcPr>
+            <w:tcW w:type="dxa" w:w="2160"/>
+          </w:tcPr>
+          <w:p>
+            <w:r/>
+            <w:r>
+              <w:drawing>
+                <wp:inline xmlns:a="http://schemas.openxmlformats.org/drawingml/2006/main" xmlns:pic="http://schemas.openxmlformats.org/drawingml/2006/picture">
+                  <wp:extent cx="1417320" cy="3928441"/>
+                  <wp:docPr id="20" name="Picture 20"/>
+                  <wp:cNvGraphicFramePr>
+                    <a:graphicFrameLocks noChangeAspect="1"/>
+                  </wp:cNvGraphicFramePr>
+                  <a:graphic>
+                    <a:graphicData uri="http://schemas.openxmlformats.org/drawingml/2006/picture">
+                      <pic:pic>
+                        <pic:nvPicPr>
+                          <pic:cNvPr id="0" name="sheet_autoexcl.png"/>
+                          <pic:cNvPicPr/>
+                        </pic:nvPicPr>
+                        <pic:blipFill>
+                          <a:blip r:embed="rId28"/>
+                          <a:stretch>
+                            <a:fillRect/>
+                          </a:stretch>
+                        </pic:blipFill>
+                        <pic:spPr>
+                          <a:xfrm>
+                            <a:off x="0" y="0"/>
+                            <a:ext cx="1417320" cy="3928441"/>
+                          </a:xfrm>
+                          <a:prstGeom prst="rect"/>
+                        </pic:spPr>
+                      </pic:pic>
+                    </a:graphicData>
+                  </a:graphic>
+                </wp:inline>
+              </w:drawing>
+            </w:r>
+          </w:p>
+          <w:p>
+            <w:pPr>
+              <w:jc w:val="center"/>
+            </w:pPr>
+            <w:r>
+              <w:rPr>
+                <w:rFonts w:ascii="Arial" w:hAnsi="Arial"/>
+                <w:color w:val="666666"/>
+                <w:sz w:val="16"/>
+              </w:rPr>
+              <w:t>Лимиты / автоисключение</w:t>
+            </w:r>
+          </w:p>
+        </w:tc>
+        <w:tc>
+          <w:tcPr>
+            <w:tcW w:type="dxa" w:w="2160"/>
+          </w:tcPr>
+          <w:p/>
+        </w:tc>
+        <w:tc>
+          <w:tcPr>
+            <w:tcW w:type="dxa" w:w="2160"/>
+          </w:tcPr>
+          <w:p/>
+        </w:tc>
+      </w:tr>
+    </w:tbl>
     <w:p/>
     <w:p>
       <w:pPr>
@@ -1252,37 +1361,195 @@
           <w:rFonts w:ascii="Arial" w:hAnsi="Arial"/>
           <w:sz w:val="21"/>
         </w:rPr>
-        <w:t>Висит, пока не закроют. Есть действие + закрытие (✕). Появляется в контексте.</w:t>
+        <w:t>Висит, пока не закроют. Есть действие + ✕. Появляется в контексте.</w:t>
       </w:r>
     </w:p>
-    <w:p>
-      <w:r>
-        <w:rPr>
-          <w:rFonts w:ascii="Arial" w:hAnsi="Arial"/>
-          <w:b/>
-          <w:sz w:val="21"/>
-        </w:rPr>
-        <w:t xml:space="preserve">Примеры: </w:t>
-      </w:r>
-      <w:r>
-        <w:rPr>
-          <w:rFonts w:ascii="Arial" w:hAnsi="Arial"/>
-          <w:sz w:val="21"/>
-        </w:rPr>
-        <w:t>«Доступна новая версия — Atualizar» (обновить страницу)</w:t>
-      </w:r>
-    </w:p>
-    <w:p>
-      <w:r>
-        <w:rPr>
-          <w:rFonts w:ascii="Arial" w:hAnsi="Arial"/>
-          <w:i/>
-          <w:color w:val="666666"/>
-          <w:sz w:val="19"/>
-        </w:rPr>
-        <w:t>🖼 Скриншот — на Figma-борде («Nova versão… Atualizar» поверх игры). Добрать из Figma.</w:t>
-      </w:r>
-    </w:p>
+    <w:tbl>
+      <w:tblPr>
+        <w:tblW w:type="auto" w:w="0"/>
+        <w:jc w:val="center"/>
+        <w:tblLook w:firstColumn="1" w:firstRow="1" w:lastColumn="0" w:lastRow="0" w:noHBand="0" w:noVBand="1" w:val="04A0"/>
+      </w:tblPr>
+      <w:tblGrid>
+        <w:gridCol w:w="2160"/>
+        <w:gridCol w:w="2160"/>
+        <w:gridCol w:w="2160"/>
+        <w:gridCol w:w="2160"/>
+      </w:tblGrid>
+      <w:tr>
+        <w:tc>
+          <w:tcPr>
+            <w:tcW w:type="dxa" w:w="2160"/>
+          </w:tcPr>
+          <w:p>
+            <w:r/>
+            <w:r>
+              <w:drawing>
+                <wp:inline xmlns:a="http://schemas.openxmlformats.org/drawingml/2006/main" xmlns:pic="http://schemas.openxmlformats.org/drawingml/2006/picture">
+                  <wp:extent cx="1417320" cy="3108744"/>
+                  <wp:docPr id="21" name="Picture 21"/>
+                  <wp:cNvGraphicFramePr>
+                    <a:graphicFrameLocks noChangeAspect="1"/>
+                  </wp:cNvGraphicFramePr>
+                  <a:graphic>
+                    <a:graphicData uri="http://schemas.openxmlformats.org/drawingml/2006/picture">
+                      <pic:pic>
+                        <pic:nvPicPr>
+                          <pic:cNvPr id="0" name="snack_ingame.png"/>
+                          <pic:cNvPicPr/>
+                        </pic:nvPicPr>
+                        <pic:blipFill>
+                          <a:blip r:embed="rId29"/>
+                          <a:stretch>
+                            <a:fillRect/>
+                          </a:stretch>
+                        </pic:blipFill>
+                        <pic:spPr>
+                          <a:xfrm>
+                            <a:off x="0" y="0"/>
+                            <a:ext cx="1417320" cy="3108744"/>
+                          </a:xfrm>
+                          <a:prstGeom prst="rect"/>
+                        </pic:spPr>
+                      </pic:pic>
+                    </a:graphicData>
+                  </a:graphic>
+                </wp:inline>
+              </w:drawing>
+            </w:r>
+          </w:p>
+          <w:p>
+            <w:pPr>
+              <w:jc w:val="center"/>
+            </w:pPr>
+            <w:r>
+              <w:rPr>
+                <w:rFonts w:ascii="Arial" w:hAnsi="Arial"/>
+                <w:color w:val="666666"/>
+                <w:sz w:val="16"/>
+              </w:rPr>
+              <w:t>В игре: «Atualizar» (persistent)</w:t>
+            </w:r>
+          </w:p>
+        </w:tc>
+        <w:tc>
+          <w:tcPr>
+            <w:tcW w:type="dxa" w:w="2160"/>
+          </w:tcPr>
+          <w:p>
+            <w:r/>
+            <w:r>
+              <w:drawing>
+                <wp:inline xmlns:a="http://schemas.openxmlformats.org/drawingml/2006/main" xmlns:pic="http://schemas.openxmlformats.org/drawingml/2006/picture">
+                  <wp:extent cx="1417320" cy="3123478"/>
+                  <wp:docPr id="22" name="Picture 22"/>
+                  <wp:cNvGraphicFramePr>
+                    <a:graphicFrameLocks noChangeAspect="1"/>
+                  </wp:cNvGraphicFramePr>
+                  <a:graphic>
+                    <a:graphicData uri="http://schemas.openxmlformats.org/drawingml/2006/picture">
+                      <pic:pic>
+                        <pic:nvPicPr>
+                          <pic:cNvPr id="0" name="snack_update_req.png"/>
+                          <pic:cNvPicPr/>
+                        </pic:nvPicPr>
+                        <pic:blipFill>
+                          <a:blip r:embed="rId30"/>
+                          <a:stretch>
+                            <a:fillRect/>
+                          </a:stretch>
+                        </pic:blipFill>
+                        <pic:spPr>
+                          <a:xfrm>
+                            <a:off x="0" y="0"/>
+                            <a:ext cx="1417320" cy="3123478"/>
+                          </a:xfrm>
+                          <a:prstGeom prst="rect"/>
+                        </pic:spPr>
+                      </pic:pic>
+                    </a:graphicData>
+                  </a:graphic>
+                </wp:inline>
+              </w:drawing>
+            </w:r>
+          </w:p>
+          <w:p>
+            <w:pPr>
+              <w:jc w:val="center"/>
+            </w:pPr>
+            <w:r>
+              <w:rPr>
+                <w:rFonts w:ascii="Arial" w:hAnsi="Arial"/>
+                <w:color w:val="666666"/>
+                <w:sz w:val="16"/>
+              </w:rPr>
+              <w:t>Обновление необходимо</w:t>
+            </w:r>
+          </w:p>
+        </w:tc>
+        <w:tc>
+          <w:tcPr>
+            <w:tcW w:type="dxa" w:w="2160"/>
+          </w:tcPr>
+          <w:p>
+            <w:r/>
+            <w:r>
+              <w:drawing>
+                <wp:inline xmlns:a="http://schemas.openxmlformats.org/drawingml/2006/main" xmlns:pic="http://schemas.openxmlformats.org/drawingml/2006/picture">
+                  <wp:extent cx="1417320" cy="3123478"/>
+                  <wp:docPr id="23" name="Picture 23"/>
+                  <wp:cNvGraphicFramePr>
+                    <a:graphicFrameLocks noChangeAspect="1"/>
+                  </wp:cNvGraphicFramePr>
+                  <a:graphic>
+                    <a:graphicData uri="http://schemas.openxmlformats.org/drawingml/2006/picture">
+                      <pic:pic>
+                        <pic:nvPicPr>
+                          <pic:cNvPr id="0" name="snack_new_version.png"/>
+                          <pic:cNvPicPr/>
+                        </pic:nvPicPr>
+                        <pic:blipFill>
+                          <a:blip r:embed="rId31"/>
+                          <a:stretch>
+                            <a:fillRect/>
+                          </a:stretch>
+                        </pic:blipFill>
+                        <pic:spPr>
+                          <a:xfrm>
+                            <a:off x="0" y="0"/>
+                            <a:ext cx="1417320" cy="3123478"/>
+                          </a:xfrm>
+                          <a:prstGeom prst="rect"/>
+                        </pic:spPr>
+                      </pic:pic>
+                    </a:graphicData>
+                  </a:graphic>
+                </wp:inline>
+              </w:drawing>
+            </w:r>
+          </w:p>
+          <w:p>
+            <w:pPr>
+              <w:jc w:val="center"/>
+            </w:pPr>
+            <w:r>
+              <w:rPr>
+                <w:rFonts w:ascii="Arial" w:hAnsi="Arial"/>
+                <w:color w:val="666666"/>
+                <w:sz w:val="16"/>
+              </w:rPr>
+              <w:t>Доступна новая версия</w:t>
+            </w:r>
+          </w:p>
+        </w:tc>
+        <w:tc>
+          <w:tcPr>
+            <w:tcW w:type="dxa" w:w="2160"/>
+          </w:tcPr>
+          <w:p/>
+        </w:tc>
+      </w:tr>
+    </w:tbl>
     <w:p/>
     <w:p>
       <w:pPr>
@@ -1310,54 +1577,188 @@
           <w:rFonts w:ascii="Arial" w:hAnsi="Arial"/>
           <w:sz w:val="21"/>
         </w:rPr>
-        <w:t>Floating, авто-скрытие 2–5 сек. Краткое подтверждение/системное событие без отдельного действия (15 шт.).</w:t>
+        <w:t>Floating, авто-скрытие 2–5 сек. Краткое подтверждение/системное событие (15 шт.).</w:t>
       </w:r>
     </w:p>
-    <w:p>
-      <w:r>
-        <w:rPr>
-          <w:rFonts w:ascii="Arial" w:hAnsi="Arial"/>
-          <w:b/>
-          <w:sz w:val="21"/>
-        </w:rPr>
-        <w:t xml:space="preserve">Системные: </w:t>
-      </w:r>
-      <w:r>
-        <w:rPr>
-          <w:rFonts w:ascii="Arial" w:hAnsi="Arial"/>
-          <w:sz w:val="21"/>
-        </w:rPr>
-        <w:t>Депозит подтверждён, избранное +/−, геолокация, ошибка обработки, ошибка пополнения, ошибка розыгрыша, лимит проигрышей, лимит ставок, бонус не для спорта</w:t>
-      </w:r>
-    </w:p>
-    <w:p>
-      <w:r>
-        <w:rPr>
-          <w:rFonts w:ascii="Arial" w:hAnsi="Arial"/>
-          <w:b/>
-          <w:sz w:val="21"/>
-        </w:rPr>
-        <w:t xml:space="preserve">Бонусные: </w:t>
-      </w:r>
-      <w:r>
-        <w:rPr>
-          <w:rFonts w:ascii="Arial" w:hAnsi="Arial"/>
-          <w:sz w:val="21"/>
-        </w:rPr>
-        <w:t>Недостаточно средств, ошибка активации бонуса, фриспины уже активны, неверная сумма ставки, ставка не в отыгрыш</w:t>
-      </w:r>
-    </w:p>
-    <w:p>
-      <w:r>
-        <w:rPr>
-          <w:rFonts w:ascii="Arial" w:hAnsi="Arial"/>
-          <w:i/>
-          <w:color w:val="666666"/>
-          <w:sz w:val="19"/>
-        </w:rPr>
-        <w:t>🖼 Скриншоты — на Figma-борде (блоки System/Bonus). Добрать из Figma.</w:t>
-      </w:r>
-    </w:p>
+    <w:tbl>
+      <w:tblPr>
+        <w:tblW w:type="auto" w:w="0"/>
+        <w:jc w:val="center"/>
+        <w:tblLook w:firstColumn="1" w:firstRow="1" w:lastColumn="0" w:lastRow="0" w:noHBand="0" w:noVBand="1" w:val="04A0"/>
+      </w:tblPr>
+      <w:tblGrid>
+        <w:gridCol w:w="2880"/>
+        <w:gridCol w:w="2880"/>
+        <w:gridCol w:w="2880"/>
+      </w:tblGrid>
+      <w:tr>
+        <w:tc>
+          <w:tcPr>
+            <w:tcW w:type="dxa" w:w="2880"/>
+          </w:tcPr>
+          <w:p>
+            <w:r/>
+            <w:r>
+              <w:drawing>
+                <wp:inline xmlns:a="http://schemas.openxmlformats.org/drawingml/2006/main" xmlns:pic="http://schemas.openxmlformats.org/drawingml/2006/picture">
+                  <wp:extent cx="1828800" cy="2050840"/>
+                  <wp:docPr id="24" name="Picture 24"/>
+                  <wp:cNvGraphicFramePr>
+                    <a:graphicFrameLocks noChangeAspect="1"/>
+                  </wp:cNvGraphicFramePr>
+                  <a:graphic>
+                    <a:graphicData uri="http://schemas.openxmlformats.org/drawingml/2006/picture">
+                      <pic:pic>
+                        <pic:nvPicPr>
+                          <pic:cNvPr id="0" name="notif_warning.png"/>
+                          <pic:cNvPicPr/>
+                        </pic:nvPicPr>
+                        <pic:blipFill>
+                          <a:blip r:embed="rId32"/>
+                          <a:stretch>
+                            <a:fillRect/>
+                          </a:stretch>
+                        </pic:blipFill>
+                        <pic:spPr>
+                          <a:xfrm>
+                            <a:off x="0" y="0"/>
+                            <a:ext cx="1828800" cy="2050840"/>
+                          </a:xfrm>
+                          <a:prstGeom prst="rect"/>
+                        </pic:spPr>
+                      </pic:pic>
+                    </a:graphicData>
+                  </a:graphic>
+                </wp:inline>
+              </w:drawing>
+            </w:r>
+          </w:p>
+          <w:p>
+            <w:pPr>
+              <w:jc w:val="center"/>
+            </w:pPr>
+            <w:r>
+              <w:rPr>
+                <w:rFonts w:ascii="Arial" w:hAnsi="Arial"/>
+                <w:color w:val="666666"/>
+                <w:sz w:val="16"/>
+              </w:rPr>
+              <w:t>System — warning (5)</w:t>
+            </w:r>
+          </w:p>
+        </w:tc>
+        <w:tc>
+          <w:tcPr>
+            <w:tcW w:type="dxa" w:w="2880"/>
+          </w:tcPr>
+          <w:p>
+            <w:r/>
+            <w:r>
+              <w:drawing>
+                <wp:inline xmlns:a="http://schemas.openxmlformats.org/drawingml/2006/main" xmlns:pic="http://schemas.openxmlformats.org/drawingml/2006/picture">
+                  <wp:extent cx="1828800" cy="2201779"/>
+                  <wp:docPr id="25" name="Picture 25"/>
+                  <wp:cNvGraphicFramePr>
+                    <a:graphicFrameLocks noChangeAspect="1"/>
+                  </wp:cNvGraphicFramePr>
+                  <a:graphic>
+                    <a:graphicData uri="http://schemas.openxmlformats.org/drawingml/2006/picture">
+                      <pic:pic>
+                        <pic:nvPicPr>
+                          <pic:cNvPr id="0" name="notif_error.png"/>
+                          <pic:cNvPicPr/>
+                        </pic:nvPicPr>
+                        <pic:blipFill>
+                          <a:blip r:embed="rId33"/>
+                          <a:stretch>
+                            <a:fillRect/>
+                          </a:stretch>
+                        </pic:blipFill>
+                        <pic:spPr>
+                          <a:xfrm>
+                            <a:off x="0" y="0"/>
+                            <a:ext cx="1828800" cy="2201779"/>
+                          </a:xfrm>
+                          <a:prstGeom prst="rect"/>
+                        </pic:spPr>
+                      </pic:pic>
+                    </a:graphicData>
+                  </a:graphic>
+                </wp:inline>
+              </w:drawing>
+            </w:r>
+          </w:p>
+          <w:p>
+            <w:pPr>
+              <w:jc w:val="center"/>
+            </w:pPr>
+            <w:r>
+              <w:rPr>
+                <w:rFonts w:ascii="Arial" w:hAnsi="Arial"/>
+                <w:color w:val="666666"/>
+                <w:sz w:val="16"/>
+              </w:rPr>
+              <w:t>System — error (5)</w:t>
+            </w:r>
+          </w:p>
+        </w:tc>
+        <w:tc>
+          <w:tcPr>
+            <w:tcW w:type="dxa" w:w="2880"/>
+          </w:tcPr>
+          <w:p>
+            <w:r/>
+            <w:r>
+              <w:drawing>
+                <wp:inline xmlns:a="http://schemas.openxmlformats.org/drawingml/2006/main" xmlns:pic="http://schemas.openxmlformats.org/drawingml/2006/picture">
+                  <wp:extent cx="1828800" cy="1877032"/>
+                  <wp:docPr id="26" name="Picture 26"/>
+                  <wp:cNvGraphicFramePr>
+                    <a:graphicFrameLocks noChangeAspect="1"/>
+                  </wp:cNvGraphicFramePr>
+                  <a:graphic>
+                    <a:graphicData uri="http://schemas.openxmlformats.org/drawingml/2006/picture">
+                      <pic:pic>
+                        <pic:nvPicPr>
+                          <pic:cNvPr id="0" name="notif_bonus.png"/>
+                          <pic:cNvPicPr/>
+                        </pic:nvPicPr>
+                        <pic:blipFill>
+                          <a:blip r:embed="rId34"/>
+                          <a:stretch>
+                            <a:fillRect/>
+                          </a:stretch>
+                        </pic:blipFill>
+                        <pic:spPr>
+                          <a:xfrm>
+                            <a:off x="0" y="0"/>
+                            <a:ext cx="1828800" cy="1877032"/>
+                          </a:xfrm>
+                          <a:prstGeom prst="rect"/>
+                        </pic:spPr>
+                      </pic:pic>
+                    </a:graphicData>
+                  </a:graphic>
+                </wp:inline>
+              </w:drawing>
+            </w:r>
+          </w:p>
+          <w:p>
+            <w:pPr>
+              <w:jc w:val="center"/>
+            </w:pPr>
+            <w:r>
+              <w:rPr>
+                <w:rFonts w:ascii="Arial" w:hAnsi="Arial"/>
+                <w:color w:val="666666"/>
+                <w:sz w:val="16"/>
+              </w:rPr>
+              <w:t>Bonus (5)</w:t>
+            </w:r>
+          </w:p>
+        </w:tc>
+      </w:tr>
+    </w:tbl>
     <w:p/>
     <w:p>
       <w:pPr>
@@ -1409,11 +1810,12 @@
       <w:r>
         <w:rPr>
           <w:rFonts w:ascii="Arial" w:hAnsi="Arial"/>
+          <w:b w:val="0"/>
           <w:i/>
           <w:color w:val="666666"/>
           <w:sz w:val="19"/>
         </w:rPr>
-        <w:t>🖼 Скриншоты — на Figma-борде. Добрать из Figma.</w:t>
+        <w:t>🖼 Отдельным кадром на борде не выделено — добрать из Figma.</w:t>
       </w:r>
     </w:p>
     <w:p/>
@@ -1446,34 +1848,143 @@
         <w:t>Постоянный информ-блок или согласие в контенте/поверх интерфейса.</w:t>
       </w:r>
     </w:p>
-    <w:p>
-      <w:r>
-        <w:rPr>
-          <w:rFonts w:ascii="Arial" w:hAnsi="Arial"/>
-          <w:b/>
-          <w:sz w:val="21"/>
-        </w:rPr>
-        <w:t xml:space="preserve">Примеры: </w:t>
-      </w:r>
-      <w:r>
-        <w:rPr>
-          <w:rFonts w:ascii="Arial" w:hAnsi="Arial"/>
-          <w:sz w:val="21"/>
-        </w:rPr>
-        <w:t>Cookie Banner</w:t>
-      </w:r>
-    </w:p>
-    <w:p>
-      <w:r>
-        <w:rPr>
-          <w:rFonts w:ascii="Arial" w:hAnsi="Arial"/>
-          <w:i/>
-          <w:color w:val="666666"/>
-          <w:sz w:val="19"/>
-        </w:rPr>
-        <w:t>🖼 Скриншот — на Figma-борде. Добрать из Figma.</w:t>
-      </w:r>
-    </w:p>
+    <w:tbl>
+      <w:tblPr>
+        <w:tblW w:type="auto" w:w="0"/>
+        <w:jc w:val="center"/>
+        <w:tblLook w:firstColumn="1" w:firstRow="1" w:lastColumn="0" w:lastRow="0" w:noHBand="0" w:noVBand="1" w:val="04A0"/>
+      </w:tblPr>
+      <w:tblGrid>
+        <w:gridCol w:w="2160"/>
+        <w:gridCol w:w="2160"/>
+        <w:gridCol w:w="2160"/>
+        <w:gridCol w:w="2160"/>
+      </w:tblGrid>
+      <w:tr>
+        <w:tc>
+          <w:tcPr>
+            <w:tcW w:type="dxa" w:w="2160"/>
+          </w:tcPr>
+          <w:p>
+            <w:r/>
+            <w:r>
+              <w:drawing>
+                <wp:inline xmlns:a="http://schemas.openxmlformats.org/drawingml/2006/main" xmlns:pic="http://schemas.openxmlformats.org/drawingml/2006/picture">
+                  <wp:extent cx="1417320" cy="264279"/>
+                  <wp:docPr id="27" name="Picture 27"/>
+                  <wp:cNvGraphicFramePr>
+                    <a:graphicFrameLocks noChangeAspect="1"/>
+                  </wp:cNvGraphicFramePr>
+                  <a:graphic>
+                    <a:graphicData uri="http://schemas.openxmlformats.org/drawingml/2006/picture">
+                      <pic:pic>
+                        <pic:nvPicPr>
+                          <pic:cNvPr id="0" name="banner_cookie.png"/>
+                          <pic:cNvPicPr/>
+                        </pic:nvPicPr>
+                        <pic:blipFill>
+                          <a:blip r:embed="rId35"/>
+                          <a:stretch>
+                            <a:fillRect/>
+                          </a:stretch>
+                        </pic:blipFill>
+                        <pic:spPr>
+                          <a:xfrm>
+                            <a:off x="0" y="0"/>
+                            <a:ext cx="1417320" cy="264279"/>
+                          </a:xfrm>
+                          <a:prstGeom prst="rect"/>
+                        </pic:spPr>
+                      </pic:pic>
+                    </a:graphicData>
+                  </a:graphic>
+                </wp:inline>
+              </w:drawing>
+            </w:r>
+          </w:p>
+          <w:p>
+            <w:pPr>
+              <w:jc w:val="center"/>
+            </w:pPr>
+            <w:r>
+              <w:rPr>
+                <w:rFonts w:ascii="Arial" w:hAnsi="Arial"/>
+                <w:color w:val="666666"/>
+                <w:sz w:val="16"/>
+              </w:rPr>
+              <w:t>Cookie Banner</w:t>
+            </w:r>
+          </w:p>
+        </w:tc>
+        <w:tc>
+          <w:tcPr>
+            <w:tcW w:type="dxa" w:w="2160"/>
+          </w:tcPr>
+          <w:p>
+            <w:r/>
+            <w:r>
+              <w:drawing>
+                <wp:inline xmlns:a="http://schemas.openxmlformats.org/drawingml/2006/main" xmlns:pic="http://schemas.openxmlformats.org/drawingml/2006/picture">
+                  <wp:extent cx="1417320" cy="929640"/>
+                  <wp:docPr id="28" name="Picture 28"/>
+                  <wp:cNvGraphicFramePr>
+                    <a:graphicFrameLocks noChangeAspect="1"/>
+                  </wp:cNvGraphicFramePr>
+                  <a:graphic>
+                    <a:graphicData uri="http://schemas.openxmlformats.org/drawingml/2006/picture">
+                      <pic:pic>
+                        <pic:nvPicPr>
+                          <pic:cNvPr id="0" name="banner_rg.png"/>
+                          <pic:cNvPicPr/>
+                        </pic:nvPicPr>
+                        <pic:blipFill>
+                          <a:blip r:embed="rId36"/>
+                          <a:stretch>
+                            <a:fillRect/>
+                          </a:stretch>
+                        </pic:blipFill>
+                        <pic:spPr>
+                          <a:xfrm>
+                            <a:off x="0" y="0"/>
+                            <a:ext cx="1417320" cy="929640"/>
+                          </a:xfrm>
+                          <a:prstGeom prst="rect"/>
+                        </pic:spPr>
+                      </pic:pic>
+                    </a:graphicData>
+                  </a:graphic>
+                </wp:inline>
+              </w:drawing>
+            </w:r>
+          </w:p>
+          <w:p>
+            <w:pPr>
+              <w:jc w:val="center"/>
+            </w:pPr>
+            <w:r>
+              <w:rPr>
+                <w:rFonts w:ascii="Arial" w:hAnsi="Arial"/>
+                <w:color w:val="666666"/>
+                <w:sz w:val="16"/>
+              </w:rPr>
+              <w:t>Atenção — ответственная игра</w:t>
+            </w:r>
+          </w:p>
+        </w:tc>
+        <w:tc>
+          <w:tcPr>
+            <w:tcW w:type="dxa" w:w="2160"/>
+          </w:tcPr>
+          <w:p/>
+        </w:tc>
+        <w:tc>
+          <w:tcPr>
+            <w:tcW w:type="dxa" w:w="2160"/>
+          </w:tcPr>
+          <w:p/>
+        </w:tc>
+      </w:tr>
+    </w:tbl>
     <w:p/>
     <w:p>
       <w:pPr>
@@ -1530,18 +2041,19 @@
           <w:rFonts w:ascii="Arial" w:hAnsi="Arial"/>
           <w:sz w:val="21"/>
         </w:rPr>
-        <w:t>«История изменений пуста» (Ainda não há alterações), пустая история ставок, нет бонусов</w:t>
+        <w:t>«История изменений пуста», пустая история ставок, нет бонусов</w:t>
       </w:r>
     </w:p>
     <w:p>
       <w:r>
         <w:rPr>
           <w:rFonts w:ascii="Arial" w:hAnsi="Arial"/>
+          <w:b w:val="0"/>
           <w:i/>
           <w:color w:val="666666"/>
           <w:sz w:val="19"/>
         </w:rPr>
-        <w:t>🖼 Скриншоты — на Figma-борде. Добрать из Figma.</w:t>
+        <w:t>🖼 На этом борде не выделено — добрать из Figma.</w:t>
       </w:r>
     </w:p>
     <w:p/>
@@ -1554,7 +2066,7 @@
           <w:rFonts w:ascii="Arial" w:hAnsi="Arial"/>
           <w:color w:val="333333"/>
         </w:rPr>
-        <w:t>8. Full-screen state (опционально)</w:t>
+        <w:t>8. Full-screen state</w:t>
       </w:r>
     </w:p>
     <w:p>
@@ -1571,37 +2083,195 @@
           <w:rFonts w:ascii="Arial" w:hAnsi="Arial"/>
           <w:sz w:val="21"/>
         </w:rPr>
-        <w:t>Полноэкранное состояние: сам экран и есть сообщение. Решить, формализуем ли как компонент.</w:t>
+        <w:t>Полноэкранное состояние: сам экран и есть сообщение (успех/блокировка/сервис).</w:t>
       </w:r>
     </w:p>
-    <w:p>
-      <w:r>
-        <w:rPr>
-          <w:rFonts w:ascii="Arial" w:hAnsi="Arial"/>
-          <w:b/>
-          <w:sz w:val="21"/>
-        </w:rPr>
-        <w:t xml:space="preserve">Примеры: </w:t>
-      </w:r>
-      <w:r>
-        <w:rPr>
-          <w:rFonts w:ascii="Arial" w:hAnsi="Arial"/>
-          <w:sz w:val="21"/>
-        </w:rPr>
-        <w:t>Регистрация завершена, подтверждение телефона, требуется обновление, технические работы, «Что-то пошло не так», доступ заблокирован</w:t>
-      </w:r>
-    </w:p>
-    <w:p>
-      <w:r>
-        <w:rPr>
-          <w:rFonts w:ascii="Arial" w:hAnsi="Arial"/>
-          <w:i/>
-          <w:color w:val="666666"/>
-          <w:sz w:val="19"/>
-        </w:rPr>
-        <w:t>🖼 Скриншоты — на Figma-борде. Добрать из Figma.</w:t>
-      </w:r>
-    </w:p>
+    <w:tbl>
+      <w:tblPr>
+        <w:tblW w:type="auto" w:w="0"/>
+        <w:jc w:val="center"/>
+        <w:tblLook w:firstColumn="1" w:firstRow="1" w:lastColumn="0" w:lastRow="0" w:noHBand="0" w:noVBand="1" w:val="04A0"/>
+      </w:tblPr>
+      <w:tblGrid>
+        <w:gridCol w:w="2160"/>
+        <w:gridCol w:w="2160"/>
+        <w:gridCol w:w="2160"/>
+        <w:gridCol w:w="2160"/>
+      </w:tblGrid>
+      <w:tr>
+        <w:tc>
+          <w:tcPr>
+            <w:tcW w:type="dxa" w:w="2160"/>
+          </w:tcPr>
+          <w:p>
+            <w:r/>
+            <w:r>
+              <w:drawing>
+                <wp:inline xmlns:a="http://schemas.openxmlformats.org/drawingml/2006/main" xmlns:pic="http://schemas.openxmlformats.org/drawingml/2006/picture">
+                  <wp:extent cx="1417320" cy="3102782"/>
+                  <wp:docPr id="29" name="Picture 29"/>
+                  <wp:cNvGraphicFramePr>
+                    <a:graphicFrameLocks noChangeAspect="1"/>
+                  </wp:cNvGraphicFramePr>
+                  <a:graphic>
+                    <a:graphicData uri="http://schemas.openxmlformats.org/drawingml/2006/picture">
+                      <pic:pic>
+                        <pic:nvPicPr>
+                          <pic:cNvPr id="0" name="fs_registered.png"/>
+                          <pic:cNvPicPr/>
+                        </pic:nvPicPr>
+                        <pic:blipFill>
+                          <a:blip r:embed="rId37"/>
+                          <a:stretch>
+                            <a:fillRect/>
+                          </a:stretch>
+                        </pic:blipFill>
+                        <pic:spPr>
+                          <a:xfrm>
+                            <a:off x="0" y="0"/>
+                            <a:ext cx="1417320" cy="3102782"/>
+                          </a:xfrm>
+                          <a:prstGeom prst="rect"/>
+                        </pic:spPr>
+                      </pic:pic>
+                    </a:graphicData>
+                  </a:graphic>
+                </wp:inline>
+              </w:drawing>
+            </w:r>
+          </w:p>
+          <w:p>
+            <w:pPr>
+              <w:jc w:val="center"/>
+            </w:pPr>
+            <w:r>
+              <w:rPr>
+                <w:rFonts w:ascii="Arial" w:hAnsi="Arial"/>
+                <w:color w:val="666666"/>
+                <w:sz w:val="16"/>
+              </w:rPr>
+              <w:t>Регистрация завершена</w:t>
+            </w:r>
+          </w:p>
+        </w:tc>
+        <w:tc>
+          <w:tcPr>
+            <w:tcW w:type="dxa" w:w="2160"/>
+          </w:tcPr>
+          <w:p>
+            <w:r/>
+            <w:r>
+              <w:drawing>
+                <wp:inline xmlns:a="http://schemas.openxmlformats.org/drawingml/2006/main" xmlns:pic="http://schemas.openxmlformats.org/drawingml/2006/picture">
+                  <wp:extent cx="1417320" cy="3138351"/>
+                  <wp:docPr id="30" name="Picture 30"/>
+                  <wp:cNvGraphicFramePr>
+                    <a:graphicFrameLocks noChangeAspect="1"/>
+                  </wp:cNvGraphicFramePr>
+                  <a:graphic>
+                    <a:graphicData uri="http://schemas.openxmlformats.org/drawingml/2006/picture">
+                      <pic:pic>
+                        <pic:nvPicPr>
+                          <pic:cNvPr id="0" name="dlg_blocked_es.png"/>
+                          <pic:cNvPicPr/>
+                        </pic:nvPicPr>
+                        <pic:blipFill>
+                          <a:blip r:embed="rId21"/>
+                          <a:stretch>
+                            <a:fillRect/>
+                          </a:stretch>
+                        </pic:blipFill>
+                        <pic:spPr>
+                          <a:xfrm>
+                            <a:off x="0" y="0"/>
+                            <a:ext cx="1417320" cy="3138351"/>
+                          </a:xfrm>
+                          <a:prstGeom prst="rect"/>
+                        </pic:spPr>
+                      </pic:pic>
+                    </a:graphicData>
+                  </a:graphic>
+                </wp:inline>
+              </w:drawing>
+            </w:r>
+          </w:p>
+          <w:p>
+            <w:pPr>
+              <w:jc w:val="center"/>
+            </w:pPr>
+            <w:r>
+              <w:rPr>
+                <w:rFonts w:ascii="Arial" w:hAnsi="Arial"/>
+                <w:color w:val="666666"/>
+                <w:sz w:val="16"/>
+              </w:rPr>
+              <w:t>Доступ заблокирован</w:t>
+            </w:r>
+          </w:p>
+        </w:tc>
+        <w:tc>
+          <w:tcPr>
+            <w:tcW w:type="dxa" w:w="2160"/>
+          </w:tcPr>
+          <w:p>
+            <w:r/>
+            <w:r>
+              <w:drawing>
+                <wp:inline xmlns:a="http://schemas.openxmlformats.org/drawingml/2006/main" xmlns:pic="http://schemas.openxmlformats.org/drawingml/2006/picture">
+                  <wp:extent cx="1417320" cy="3123478"/>
+                  <wp:docPr id="31" name="Picture 31"/>
+                  <wp:cNvGraphicFramePr>
+                    <a:graphicFrameLocks noChangeAspect="1"/>
+                  </wp:cNvGraphicFramePr>
+                  <a:graphic>
+                    <a:graphicData uri="http://schemas.openxmlformats.org/drawingml/2006/picture">
+                      <pic:pic>
+                        <pic:nvPicPr>
+                          <pic:cNvPr id="0" name="snack_update_req.png"/>
+                          <pic:cNvPicPr/>
+                        </pic:nvPicPr>
+                        <pic:blipFill>
+                          <a:blip r:embed="rId30"/>
+                          <a:stretch>
+                            <a:fillRect/>
+                          </a:stretch>
+                        </pic:blipFill>
+                        <pic:spPr>
+                          <a:xfrm>
+                            <a:off x="0" y="0"/>
+                            <a:ext cx="1417320" cy="3123478"/>
+                          </a:xfrm>
+                          <a:prstGeom prst="rect"/>
+                        </pic:spPr>
+                      </pic:pic>
+                    </a:graphicData>
+                  </a:graphic>
+                </wp:inline>
+              </w:drawing>
+            </w:r>
+          </w:p>
+          <w:p>
+            <w:pPr>
+              <w:jc w:val="center"/>
+            </w:pPr>
+            <w:r>
+              <w:rPr>
+                <w:rFonts w:ascii="Arial" w:hAnsi="Arial"/>
+                <w:color w:val="666666"/>
+                <w:sz w:val="16"/>
+              </w:rPr>
+              <w:t>Требуется обновление</w:t>
+            </w:r>
+          </w:p>
+        </w:tc>
+        <w:tc>
+          <w:tcPr>
+            <w:tcW w:type="dxa" w:w="2160"/>
+          </w:tcPr>
+          <w:p/>
+        </w:tc>
+      </w:tr>
+    </w:tbl>
     <w:sectPr>
       <w:pgSz w:w="12240" w:h="15840"/>
       <w:pgMar w:top="1440" w:right="1800" w:bottom="1440" w:left="1800" w:header="720" w:footer="720" w:gutter="0"/>

</xml_diff>